<commit_message>
chore: initialize frontend structure from sirafit-2 design
</commit_message>
<xml_diff>
--- a/SiraFit - Production PRD.docx
+++ b/SiraFit - Production PRD.docx
@@ -23,14 +23,21 @@
           <w:b/>
           <w:bCs/>
         </w:rPr>
-        <w:t xml:space="preserve"> — Production PRD</w:t>
-      </w:r>
-    </w:p>
-    <w:p>
-      <w:r>
-        <w:pict w14:anchorId="330712E6">
-          <v:rect id="_x0000_i1157" style="width:0;height:1.5pt" o:hralign="center" o:hrstd="t" o:hr="t" fillcolor="#a0a0a0" stroked="f"/>
-        </w:pict>
+        <w:t xml:space="preserve"> </w:t>
+      </w:r>
+      <w:r>
+        <w:rPr>
+          <w:b/>
+          <w:bCs/>
+        </w:rPr>
+        <w:t>-</w:t>
+      </w:r>
+      <w:r>
+        <w:rPr>
+          <w:b/>
+          <w:bCs/>
+        </w:rPr>
+        <w:t xml:space="preserve"> Production PRD</w:t>
       </w:r>
     </w:p>
     <w:p>
@@ -207,13 +214,6 @@
       </w:r>
     </w:p>
     <w:p>
-      <w:r>
-        <w:pict w14:anchorId="316CBE40">
-          <v:rect id="_x0000_i1158" style="width:0;height:1.5pt" o:hralign="center" o:hrstd="t" o:hr="t" fillcolor="#a0a0a0" stroked="f"/>
-        </w:pict>
-      </w:r>
-    </w:p>
-    <w:p>
       <w:pPr>
         <w:rPr>
           <w:b/>
@@ -342,8 +342,30 @@
         </w:numPr>
       </w:pPr>
       <w:r>
+        <w:t xml:space="preserve">manually browse job boards </w:t>
+      </w:r>
+    </w:p>
+    <w:p>
+      <w:pPr>
+        <w:numPr>
+          <w:ilvl w:val="0"/>
+          <w:numId w:val="4"/>
+        </w:numPr>
+      </w:pPr>
+      <w:r>
+        <w:t xml:space="preserve">copy job descriptions </w:t>
+      </w:r>
+    </w:p>
+    <w:p>
+      <w:pPr>
+        <w:numPr>
+          <w:ilvl w:val="0"/>
+          <w:numId w:val="4"/>
+        </w:numPr>
+      </w:pPr>
+      <w:r>
         <w:lastRenderedPageBreak/>
-        <w:t xml:space="preserve">manually browse job boards </w:t>
+        <w:t xml:space="preserve">guess resume adjustments </w:t>
       </w:r>
     </w:p>
     <w:p>
@@ -354,7 +376,7 @@
         </w:numPr>
       </w:pPr>
       <w:r>
-        <w:t xml:space="preserve">copy job descriptions </w:t>
+        <w:t xml:space="preserve">submit applications blindly </w:t>
       </w:r>
     </w:p>
     <w:p>
@@ -365,28 +387,6 @@
         </w:numPr>
       </w:pPr>
       <w:r>
-        <w:t xml:space="preserve">guess resume adjustments </w:t>
-      </w:r>
-    </w:p>
-    <w:p>
-      <w:pPr>
-        <w:numPr>
-          <w:ilvl w:val="0"/>
-          <w:numId w:val="4"/>
-        </w:numPr>
-      </w:pPr>
-      <w:r>
-        <w:t xml:space="preserve">submit applications blindly </w:t>
-      </w:r>
-    </w:p>
-    <w:p>
-      <w:pPr>
-        <w:numPr>
-          <w:ilvl w:val="0"/>
-          <w:numId w:val="4"/>
-        </w:numPr>
-      </w:pPr>
-      <w:r>
         <w:t xml:space="preserve">lose track of outcomes </w:t>
       </w:r>
     </w:p>
@@ -457,7 +457,7 @@
     <w:p>
       <w:r>
         <w:pict w14:anchorId="33CB6CAD">
-          <v:rect id="_x0000_i1159" style="width:0;height:1.5pt" o:hralign="center" o:hrstd="t" o:hr="t" fillcolor="#a0a0a0" stroked="f"/>
+          <v:rect id="_x0000_i1089" style="width:0;height:1.5pt" o:hralign="center" o:hrstd="t" o:hr="t" fillcolor="#a0a0a0" stroked="f"/>
         </w:pict>
       </w:r>
     </w:p>
@@ -546,7 +546,7 @@
     <w:p>
       <w:r>
         <w:pict w14:anchorId="1E14F102">
-          <v:rect id="_x0000_i1160" style="width:0;height:1.5pt" o:hralign="center" o:hrstd="t" o:hr="t" fillcolor="#a0a0a0" stroked="f"/>
+          <v:rect id="_x0000_i1090" style="width:0;height:1.5pt" o:hralign="center" o:hrstd="t" o:hr="t" fillcolor="#a0a0a0" stroked="f"/>
         </w:pict>
       </w:r>
     </w:p>
@@ -688,14 +688,74 @@
         </w:numPr>
       </w:pPr>
       <w:r>
+        <w:t xml:space="preserve">inconsistent technical understanding </w:t>
+      </w:r>
+    </w:p>
+    <w:p>
+      <w:r>
+        <w:pict w14:anchorId="246E8A22">
+          <v:rect id="_x0000_i1091" style="width:0;height:1.5pt" o:hralign="center" o:hrstd="t" o:hr="t" fillcolor="#a0a0a0" stroked="f"/>
+        </w:pict>
+      </w:r>
+    </w:p>
+    <w:p>
+      <w:pPr>
+        <w:rPr>
+          <w:b/>
+          <w:bCs/>
+        </w:rPr>
+      </w:pPr>
+      <w:r>
+        <w:rPr>
+          <w:b/>
+          <w:bCs/>
+        </w:rPr>
         <w:lastRenderedPageBreak/>
-        <w:t xml:space="preserve">inconsistent technical understanding </w:t>
-      </w:r>
-    </w:p>
-    <w:p>
-      <w:r>
-        <w:pict w14:anchorId="246E8A22">
-          <v:rect id="_x0000_i1161" style="width:0;height:1.5pt" o:hralign="center" o:hrstd="t" o:hr="t" fillcolor="#a0a0a0" stroked="f"/>
+        <w:t>Secondary User</w:t>
+      </w:r>
+    </w:p>
+    <w:p>
+      <w:r>
+        <w:t>Early Career Tech Professional</w:t>
+      </w:r>
+    </w:p>
+    <w:p>
+      <w:pPr>
+        <w:numPr>
+          <w:ilvl w:val="0"/>
+          <w:numId w:val="12"/>
+        </w:numPr>
+      </w:pPr>
+      <w:r>
+        <w:t xml:space="preserve">slightly more experienced </w:t>
+      </w:r>
+    </w:p>
+    <w:p>
+      <w:pPr>
+        <w:numPr>
+          <w:ilvl w:val="0"/>
+          <w:numId w:val="12"/>
+        </w:numPr>
+      </w:pPr>
+      <w:r>
+        <w:t xml:space="preserve">applies selectively </w:t>
+      </w:r>
+    </w:p>
+    <w:p>
+      <w:pPr>
+        <w:numPr>
+          <w:ilvl w:val="0"/>
+          <w:numId w:val="12"/>
+        </w:numPr>
+      </w:pPr>
+      <w:r>
+        <w:t xml:space="preserve">values tracking and analytics </w:t>
+      </w:r>
+    </w:p>
+    <w:p>
+      <w:r>
+        <w:pict w14:anchorId="3FB5FADD">
+          <v:rect id="_x0000_i1092" style="width:0;height:1.5pt" o:hralign="center" o:hrstd="t" o:hr="t" fillcolor="#a0a0a0" stroked="f"/>
         </w:pict>
       </w:r>
     </w:p>
@@ -711,51 +771,195 @@
           <w:b/>
           <w:bCs/>
         </w:rPr>
-        <w:t>Secondary User</w:t>
-      </w:r>
-    </w:p>
-    <w:p>
-      <w:r>
-        <w:t>Early Career Tech Professional</w:t>
-      </w:r>
-    </w:p>
-    <w:p>
-      <w:pPr>
-        <w:numPr>
-          <w:ilvl w:val="0"/>
-          <w:numId w:val="12"/>
-        </w:numPr>
-      </w:pPr>
-      <w:r>
-        <w:t xml:space="preserve">slightly more experienced </w:t>
-      </w:r>
-    </w:p>
-    <w:p>
-      <w:pPr>
-        <w:numPr>
-          <w:ilvl w:val="0"/>
-          <w:numId w:val="12"/>
-        </w:numPr>
-      </w:pPr>
-      <w:r>
-        <w:t xml:space="preserve">applies selectively </w:t>
-      </w:r>
-    </w:p>
-    <w:p>
-      <w:pPr>
-        <w:numPr>
-          <w:ilvl w:val="0"/>
-          <w:numId w:val="12"/>
-        </w:numPr>
-      </w:pPr>
-      <w:r>
-        <w:t xml:space="preserve">values tracking and analytics </w:t>
-      </w:r>
-    </w:p>
-    <w:p>
-      <w:r>
-        <w:pict w14:anchorId="3FB5FADD">
-          <v:rect id="_x0000_i1162" style="width:0;height:1.5pt" o:hralign="center" o:hrstd="t" o:hr="t" fillcolor="#a0a0a0" stroked="f"/>
+        <w:t xml:space="preserve">5. Goals and </w:t>
+      </w:r>
+      <w:proofErr w:type="gramStart"/>
+      <w:r>
+        <w:rPr>
+          <w:b/>
+          <w:bCs/>
+        </w:rPr>
+        <w:t>Non-Goals</w:t>
+      </w:r>
+      <w:proofErr w:type="gramEnd"/>
+    </w:p>
+    <w:p>
+      <w:pPr>
+        <w:rPr>
+          <w:b/>
+          <w:bCs/>
+        </w:rPr>
+      </w:pPr>
+      <w:r>
+        <w:rPr>
+          <w:b/>
+          <w:bCs/>
+        </w:rPr>
+        <w:t>Goals</w:t>
+      </w:r>
+    </w:p>
+    <w:p>
+      <w:pPr>
+        <w:numPr>
+          <w:ilvl w:val="0"/>
+          <w:numId w:val="13"/>
+        </w:numPr>
+      </w:pPr>
+      <w:r>
+        <w:t xml:space="preserve">automate job ingestion from ATS sources </w:t>
+      </w:r>
+    </w:p>
+    <w:p>
+      <w:pPr>
+        <w:numPr>
+          <w:ilvl w:val="0"/>
+          <w:numId w:val="13"/>
+        </w:numPr>
+      </w:pPr>
+      <w:r>
+        <w:t xml:space="preserve">normalize and deduplicate job data </w:t>
+      </w:r>
+    </w:p>
+    <w:p>
+      <w:pPr>
+        <w:numPr>
+          <w:ilvl w:val="0"/>
+          <w:numId w:val="13"/>
+        </w:numPr>
+      </w:pPr>
+      <w:r>
+        <w:t xml:space="preserve">score job relevance deterministically </w:t>
+      </w:r>
+    </w:p>
+    <w:p>
+      <w:pPr>
+        <w:numPr>
+          <w:ilvl w:val="0"/>
+          <w:numId w:val="13"/>
+        </w:numPr>
+      </w:pPr>
+      <w:r>
+        <w:t xml:space="preserve">generate structured resumes per job </w:t>
+      </w:r>
+    </w:p>
+    <w:p>
+      <w:pPr>
+        <w:numPr>
+          <w:ilvl w:val="0"/>
+          <w:numId w:val="13"/>
+        </w:numPr>
+      </w:pPr>
+      <w:r>
+        <w:t xml:space="preserve">track application lifecycle </w:t>
+      </w:r>
+    </w:p>
+    <w:p>
+      <w:pPr>
+        <w:numPr>
+          <w:ilvl w:val="0"/>
+          <w:numId w:val="13"/>
+        </w:numPr>
+      </w:pPr>
+      <w:r>
+        <w:t xml:space="preserve">support offline-first local execution </w:t>
+      </w:r>
+    </w:p>
+    <w:p>
+      <w:pPr>
+        <w:numPr>
+          <w:ilvl w:val="0"/>
+          <w:numId w:val="13"/>
+        </w:numPr>
+      </w:pPr>
+      <w:r>
+        <w:t xml:space="preserve">support user-owned AI API key execution </w:t>
+      </w:r>
+    </w:p>
+    <w:p>
+      <w:pPr>
+        <w:rPr>
+          <w:b/>
+          <w:bCs/>
+        </w:rPr>
+      </w:pPr>
+      <w:r>
+        <w:rPr>
+          <w:b/>
+          <w:bCs/>
+        </w:rPr>
+        <w:t>Non-Goals</w:t>
+      </w:r>
+    </w:p>
+    <w:p>
+      <w:pPr>
+        <w:numPr>
+          <w:ilvl w:val="0"/>
+          <w:numId w:val="14"/>
+        </w:numPr>
+      </w:pPr>
+      <w:r>
+        <w:t xml:space="preserve">full auto-application submission </w:t>
+      </w:r>
+    </w:p>
+    <w:p>
+      <w:pPr>
+        <w:numPr>
+          <w:ilvl w:val="0"/>
+          <w:numId w:val="14"/>
+        </w:numPr>
+      </w:pPr>
+      <w:r>
+        <w:t xml:space="preserve">recruiter or hiring-side tooling </w:t>
+      </w:r>
+    </w:p>
+    <w:p>
+      <w:pPr>
+        <w:numPr>
+          <w:ilvl w:val="0"/>
+          <w:numId w:val="14"/>
+        </w:numPr>
+      </w:pPr>
+      <w:r>
+        <w:t xml:space="preserve">social networking features </w:t>
+      </w:r>
+    </w:p>
+    <w:p>
+      <w:pPr>
+        <w:numPr>
+          <w:ilvl w:val="0"/>
+          <w:numId w:val="14"/>
+        </w:numPr>
+      </w:pPr>
+      <w:r>
+        <w:t xml:space="preserve">real-time collaborative editing </w:t>
+      </w:r>
+    </w:p>
+    <w:p>
+      <w:pPr>
+        <w:numPr>
+          <w:ilvl w:val="0"/>
+          <w:numId w:val="14"/>
+        </w:numPr>
+      </w:pPr>
+      <w:r>
+        <w:t xml:space="preserve">enterprise HR integration </w:t>
+      </w:r>
+    </w:p>
+    <w:p>
+      <w:pPr>
+        <w:numPr>
+          <w:ilvl w:val="0"/>
+          <w:numId w:val="14"/>
+        </w:numPr>
+      </w:pPr>
+      <w:r>
+        <w:t xml:space="preserve">multi-user shared accounts </w:t>
+      </w:r>
+    </w:p>
+    <w:p>
+      <w:r>
+        <w:pict w14:anchorId="4365D92F">
+          <v:rect id="_x0000_i1093" style="width:0;height:1.5pt" o:hralign="center" o:hrstd="t" o:hr="t" fillcolor="#a0a0a0" stroked="f"/>
         </w:pict>
       </w:r>
     </w:p>
@@ -771,195 +975,335 @@
           <w:b/>
           <w:bCs/>
         </w:rPr>
-        <w:t xml:space="preserve">5. Goals and </w:t>
-      </w:r>
-      <w:proofErr w:type="gramStart"/>
-      <w:r>
-        <w:rPr>
-          <w:b/>
-          <w:bCs/>
-        </w:rPr>
-        <w:t>Non-Goals</w:t>
-      </w:r>
-      <w:proofErr w:type="gramEnd"/>
-    </w:p>
-    <w:p>
-      <w:pPr>
-        <w:rPr>
-          <w:b/>
-          <w:bCs/>
-        </w:rPr>
-      </w:pPr>
-      <w:r>
-        <w:rPr>
-          <w:b/>
-          <w:bCs/>
-        </w:rPr>
-        <w:t>Goals</w:t>
-      </w:r>
-    </w:p>
-    <w:p>
-      <w:pPr>
-        <w:numPr>
-          <w:ilvl w:val="0"/>
-          <w:numId w:val="13"/>
-        </w:numPr>
-      </w:pPr>
-      <w:r>
-        <w:t xml:space="preserve">automate job ingestion from ATS sources </w:t>
-      </w:r>
-    </w:p>
-    <w:p>
-      <w:pPr>
-        <w:numPr>
-          <w:ilvl w:val="0"/>
-          <w:numId w:val="13"/>
-        </w:numPr>
-      </w:pPr>
-      <w:r>
-        <w:t xml:space="preserve">normalize and deduplicate job data </w:t>
-      </w:r>
-    </w:p>
-    <w:p>
-      <w:pPr>
-        <w:numPr>
-          <w:ilvl w:val="0"/>
-          <w:numId w:val="13"/>
-        </w:numPr>
-      </w:pPr>
-      <w:r>
-        <w:t xml:space="preserve">score job relevance deterministically </w:t>
-      </w:r>
-    </w:p>
-    <w:p>
-      <w:pPr>
-        <w:numPr>
-          <w:ilvl w:val="0"/>
-          <w:numId w:val="13"/>
-        </w:numPr>
-      </w:pPr>
-      <w:r>
-        <w:t xml:space="preserve">generate structured resumes per job </w:t>
-      </w:r>
-    </w:p>
-    <w:p>
-      <w:pPr>
-        <w:numPr>
-          <w:ilvl w:val="0"/>
-          <w:numId w:val="13"/>
-        </w:numPr>
-      </w:pPr>
-      <w:r>
-        <w:t xml:space="preserve">track application lifecycle </w:t>
-      </w:r>
-    </w:p>
-    <w:p>
-      <w:pPr>
-        <w:numPr>
-          <w:ilvl w:val="0"/>
-          <w:numId w:val="13"/>
-        </w:numPr>
-      </w:pPr>
-      <w:r>
-        <w:t xml:space="preserve">support offline-first local execution </w:t>
-      </w:r>
-    </w:p>
-    <w:p>
-      <w:pPr>
-        <w:numPr>
-          <w:ilvl w:val="0"/>
-          <w:numId w:val="13"/>
-        </w:numPr>
-      </w:pPr>
-      <w:r>
-        <w:t xml:space="preserve">support user-owned AI API key execution </w:t>
-      </w:r>
-    </w:p>
-    <w:p>
-      <w:pPr>
-        <w:rPr>
-          <w:b/>
-          <w:bCs/>
-        </w:rPr>
-      </w:pPr>
-      <w:r>
-        <w:rPr>
-          <w:b/>
-          <w:bCs/>
-        </w:rPr>
-        <w:t>Non-Goals</w:t>
-      </w:r>
-    </w:p>
-    <w:p>
-      <w:pPr>
-        <w:numPr>
-          <w:ilvl w:val="0"/>
-          <w:numId w:val="14"/>
-        </w:numPr>
-      </w:pPr>
-      <w:r>
-        <w:t xml:space="preserve">full auto-application submission </w:t>
-      </w:r>
-    </w:p>
-    <w:p>
-      <w:pPr>
-        <w:numPr>
-          <w:ilvl w:val="0"/>
-          <w:numId w:val="14"/>
-        </w:numPr>
-      </w:pPr>
-      <w:r>
-        <w:t xml:space="preserve">recruiter or hiring-side tooling </w:t>
-      </w:r>
-    </w:p>
-    <w:p>
-      <w:pPr>
-        <w:numPr>
-          <w:ilvl w:val="0"/>
-          <w:numId w:val="14"/>
-        </w:numPr>
-      </w:pPr>
-      <w:r>
-        <w:t xml:space="preserve">social networking features </w:t>
-      </w:r>
-    </w:p>
-    <w:p>
-      <w:pPr>
-        <w:numPr>
-          <w:ilvl w:val="0"/>
-          <w:numId w:val="14"/>
-        </w:numPr>
-      </w:pPr>
-      <w:r>
-        <w:t xml:space="preserve">real-time collaborative editing </w:t>
-      </w:r>
-    </w:p>
-    <w:p>
-      <w:pPr>
-        <w:numPr>
-          <w:ilvl w:val="0"/>
-          <w:numId w:val="14"/>
-        </w:numPr>
-      </w:pPr>
-      <w:r>
-        <w:t xml:space="preserve">enterprise HR integration </w:t>
-      </w:r>
-    </w:p>
-    <w:p>
-      <w:pPr>
-        <w:numPr>
-          <w:ilvl w:val="0"/>
-          <w:numId w:val="14"/>
-        </w:numPr>
-      </w:pPr>
-      <w:r>
-        <w:t xml:space="preserve">multi-user shared accounts </w:t>
-      </w:r>
-    </w:p>
-    <w:p>
-      <w:r>
-        <w:pict w14:anchorId="4365D92F">
-          <v:rect id="_x0000_i1163" style="width:0;height:1.5pt" o:hralign="center" o:hrstd="t" o:hr="t" fillcolor="#a0a0a0" stroked="f"/>
+        <w:t>6. MVP Scope</w:t>
+      </w:r>
+    </w:p>
+    <w:p>
+      <w:pPr>
+        <w:rPr>
+          <w:b/>
+          <w:bCs/>
+        </w:rPr>
+      </w:pPr>
+      <w:r>
+        <w:rPr>
+          <w:b/>
+          <w:bCs/>
+        </w:rPr>
+        <w:t>Must-Have Features</w:t>
+      </w:r>
+    </w:p>
+    <w:p>
+      <w:pPr>
+        <w:rPr>
+          <w:b/>
+          <w:bCs/>
+        </w:rPr>
+      </w:pPr>
+      <w:r>
+        <w:rPr>
+          <w:b/>
+          <w:bCs/>
+        </w:rPr>
+        <w:t>Job System</w:t>
+      </w:r>
+    </w:p>
+    <w:p>
+      <w:pPr>
+        <w:numPr>
+          <w:ilvl w:val="0"/>
+          <w:numId w:val="15"/>
+        </w:numPr>
+      </w:pPr>
+      <w:r>
+        <w:t xml:space="preserve">ATS scraping (Lever, Greenhouse, Ashby) </w:t>
+      </w:r>
+    </w:p>
+    <w:p>
+      <w:pPr>
+        <w:numPr>
+          <w:ilvl w:val="0"/>
+          <w:numId w:val="15"/>
+        </w:numPr>
+      </w:pPr>
+      <w:r>
+        <w:t xml:space="preserve">job normalization pipeline </w:t>
+      </w:r>
+    </w:p>
+    <w:p>
+      <w:pPr>
+        <w:numPr>
+          <w:ilvl w:val="0"/>
+          <w:numId w:val="15"/>
+        </w:numPr>
+      </w:pPr>
+      <w:r>
+        <w:t xml:space="preserve">deterministic deduplication (multi-stage) </w:t>
+      </w:r>
+    </w:p>
+    <w:p>
+      <w:pPr>
+        <w:numPr>
+          <w:ilvl w:val="0"/>
+          <w:numId w:val="15"/>
+        </w:numPr>
+      </w:pPr>
+      <w:r>
+        <w:t xml:space="preserve">job scoring engine </w:t>
+      </w:r>
+    </w:p>
+    <w:p>
+      <w:pPr>
+        <w:rPr>
+          <w:b/>
+          <w:bCs/>
+        </w:rPr>
+      </w:pPr>
+      <w:r>
+        <w:rPr>
+          <w:b/>
+          <w:bCs/>
+        </w:rPr>
+        <w:t>Resume System</w:t>
+      </w:r>
+    </w:p>
+    <w:p>
+      <w:pPr>
+        <w:numPr>
+          <w:ilvl w:val="0"/>
+          <w:numId w:val="16"/>
+        </w:numPr>
+      </w:pPr>
+      <w:r>
+        <w:t xml:space="preserve">structured resume JSON (canonical) </w:t>
+      </w:r>
+    </w:p>
+    <w:p>
+      <w:pPr>
+        <w:numPr>
+          <w:ilvl w:val="0"/>
+          <w:numId w:val="16"/>
+        </w:numPr>
+      </w:pPr>
+      <w:r>
+        <w:t xml:space="preserve">AI resume tailoring (Gemini API key) </w:t>
+      </w:r>
+    </w:p>
+    <w:p>
+      <w:pPr>
+        <w:numPr>
+          <w:ilvl w:val="0"/>
+          <w:numId w:val="16"/>
+        </w:numPr>
+      </w:pPr>
+      <w:r>
+        <w:t xml:space="preserve">cover letter generation </w:t>
+      </w:r>
+    </w:p>
+    <w:p>
+      <w:pPr>
+        <w:numPr>
+          <w:ilvl w:val="0"/>
+          <w:numId w:val="16"/>
+        </w:numPr>
+      </w:pPr>
+      <w:r>
+        <w:t xml:space="preserve">template-based PDF rendering </w:t>
+      </w:r>
+    </w:p>
+    <w:p>
+      <w:pPr>
+        <w:rPr>
+          <w:b/>
+          <w:bCs/>
+        </w:rPr>
+      </w:pPr>
+      <w:r>
+        <w:rPr>
+          <w:b/>
+          <w:bCs/>
+        </w:rPr>
+        <w:lastRenderedPageBreak/>
+        <w:t>Application Tracking</w:t>
+      </w:r>
+    </w:p>
+    <w:p>
+      <w:pPr>
+        <w:numPr>
+          <w:ilvl w:val="0"/>
+          <w:numId w:val="17"/>
+        </w:numPr>
+      </w:pPr>
+      <w:r>
+        <w:t xml:space="preserve">manual + assisted status updates </w:t>
+      </w:r>
+    </w:p>
+    <w:p>
+      <w:pPr>
+        <w:numPr>
+          <w:ilvl w:val="0"/>
+          <w:numId w:val="17"/>
+        </w:numPr>
+      </w:pPr>
+      <w:r>
+        <w:t xml:space="preserve">timeline tracking </w:t>
+      </w:r>
+    </w:p>
+    <w:p>
+      <w:pPr>
+        <w:numPr>
+          <w:ilvl w:val="0"/>
+          <w:numId w:val="17"/>
+        </w:numPr>
+      </w:pPr>
+      <w:r>
+        <w:t xml:space="preserve">notes per application </w:t>
+      </w:r>
+    </w:p>
+    <w:p>
+      <w:pPr>
+        <w:rPr>
+          <w:b/>
+          <w:bCs/>
+        </w:rPr>
+      </w:pPr>
+      <w:r>
+        <w:rPr>
+          <w:b/>
+          <w:bCs/>
+        </w:rPr>
+        <w:t>Local Agent</w:t>
+      </w:r>
+    </w:p>
+    <w:p>
+      <w:pPr>
+        <w:numPr>
+          <w:ilvl w:val="0"/>
+          <w:numId w:val="18"/>
+        </w:numPr>
+      </w:pPr>
+      <w:r>
+        <w:t xml:space="preserve">Playwright scraping runtime </w:t>
+      </w:r>
+    </w:p>
+    <w:p>
+      <w:pPr>
+        <w:numPr>
+          <w:ilvl w:val="0"/>
+          <w:numId w:val="18"/>
+        </w:numPr>
+      </w:pPr>
+      <w:r>
+        <w:t xml:space="preserve">AI execution orchestration </w:t>
+      </w:r>
+    </w:p>
+    <w:p>
+      <w:pPr>
+        <w:numPr>
+          <w:ilvl w:val="0"/>
+          <w:numId w:val="18"/>
+        </w:numPr>
+      </w:pPr>
+      <w:r>
+        <w:t xml:space="preserve">local queue system </w:t>
+      </w:r>
+    </w:p>
+    <w:p>
+      <w:pPr>
+        <w:numPr>
+          <w:ilvl w:val="0"/>
+          <w:numId w:val="18"/>
+        </w:numPr>
+      </w:pPr>
+      <w:r>
+        <w:t xml:space="preserve">event log storage </w:t>
+      </w:r>
+    </w:p>
+    <w:p>
+      <w:pPr>
+        <w:numPr>
+          <w:ilvl w:val="0"/>
+          <w:numId w:val="18"/>
+        </w:numPr>
+      </w:pPr>
+      <w:r>
+        <w:t xml:space="preserve">sync batching </w:t>
+      </w:r>
+    </w:p>
+    <w:p>
+      <w:pPr>
+        <w:rPr>
+          <w:b/>
+          <w:bCs/>
+        </w:rPr>
+      </w:pPr>
+      <w:r>
+        <w:rPr>
+          <w:b/>
+          <w:bCs/>
+        </w:rPr>
+        <w:t>Cloud Backend</w:t>
+      </w:r>
+    </w:p>
+    <w:p>
+      <w:pPr>
+        <w:numPr>
+          <w:ilvl w:val="0"/>
+          <w:numId w:val="19"/>
+        </w:numPr>
+      </w:pPr>
+      <w:r>
+        <w:t xml:space="preserve">user data storage </w:t>
+      </w:r>
+    </w:p>
+    <w:p>
+      <w:pPr>
+        <w:numPr>
+          <w:ilvl w:val="0"/>
+          <w:numId w:val="19"/>
+        </w:numPr>
+      </w:pPr>
+      <w:r>
+        <w:t xml:space="preserve">job storage </w:t>
+      </w:r>
+    </w:p>
+    <w:p>
+      <w:pPr>
+        <w:numPr>
+          <w:ilvl w:val="0"/>
+          <w:numId w:val="19"/>
+        </w:numPr>
+      </w:pPr>
+      <w:r>
+        <w:t xml:space="preserve">resume storage </w:t>
+      </w:r>
+    </w:p>
+    <w:p>
+      <w:pPr>
+        <w:numPr>
+          <w:ilvl w:val="0"/>
+          <w:numId w:val="19"/>
+        </w:numPr>
+      </w:pPr>
+      <w:r>
+        <w:t xml:space="preserve">analytics aggregation </w:t>
+      </w:r>
+    </w:p>
+    <w:p>
+      <w:pPr>
+        <w:numPr>
+          <w:ilvl w:val="0"/>
+          <w:numId w:val="19"/>
+        </w:numPr>
+      </w:pPr>
+      <w:r>
+        <w:t xml:space="preserve">sync ingestion API </w:t>
+      </w:r>
+    </w:p>
+    <w:p>
+      <w:r>
+        <w:pict w14:anchorId="3549C54E">
+          <v:rect id="_x0000_i1094" style="width:0;height:1.5pt" o:hralign="center" o:hrstd="t" o:hr="t" fillcolor="#a0a0a0" stroked="f"/>
         </w:pict>
       </w:r>
     </w:p>
@@ -975,141 +1319,305 @@
           <w:b/>
           <w:bCs/>
         </w:rPr>
-        <w:t>6. MVP Scope</w:t>
-      </w:r>
-    </w:p>
-    <w:p>
-      <w:pPr>
-        <w:rPr>
-          <w:b/>
-          <w:bCs/>
-        </w:rPr>
-      </w:pPr>
-      <w:r>
-        <w:rPr>
-          <w:b/>
-          <w:bCs/>
-        </w:rPr>
-        <w:t>Must-Have Features</w:t>
-      </w:r>
-    </w:p>
-    <w:p>
-      <w:pPr>
-        <w:rPr>
-          <w:b/>
-          <w:bCs/>
-        </w:rPr>
-      </w:pPr>
-      <w:r>
-        <w:rPr>
-          <w:b/>
-          <w:bCs/>
-        </w:rPr>
-        <w:t>Job System</w:t>
-      </w:r>
-    </w:p>
-    <w:p>
-      <w:pPr>
-        <w:numPr>
-          <w:ilvl w:val="0"/>
-          <w:numId w:val="15"/>
-        </w:numPr>
-      </w:pPr>
-      <w:r>
-        <w:t xml:space="preserve">ATS scraping (Lever, Greenhouse, Ashby) </w:t>
-      </w:r>
-    </w:p>
-    <w:p>
-      <w:pPr>
-        <w:numPr>
-          <w:ilvl w:val="0"/>
-          <w:numId w:val="15"/>
-        </w:numPr>
-      </w:pPr>
-      <w:r>
-        <w:t xml:space="preserve">job normalization pipeline </w:t>
-      </w:r>
-    </w:p>
-    <w:p>
-      <w:pPr>
-        <w:numPr>
-          <w:ilvl w:val="0"/>
-          <w:numId w:val="15"/>
-        </w:numPr>
-      </w:pPr>
-      <w:r>
-        <w:t xml:space="preserve">deterministic deduplication (multi-stage) </w:t>
-      </w:r>
-    </w:p>
-    <w:p>
-      <w:pPr>
-        <w:numPr>
-          <w:ilvl w:val="0"/>
-          <w:numId w:val="15"/>
-        </w:numPr>
-      </w:pPr>
-      <w:r>
-        <w:t xml:space="preserve">job scoring engine </w:t>
-      </w:r>
-    </w:p>
-    <w:p>
-      <w:pPr>
-        <w:rPr>
-          <w:b/>
-          <w:bCs/>
-        </w:rPr>
-      </w:pPr>
-      <w:r>
-        <w:rPr>
-          <w:b/>
-          <w:bCs/>
-        </w:rPr>
-        <w:t>Resume System</w:t>
-      </w:r>
-    </w:p>
-    <w:p>
-      <w:pPr>
-        <w:numPr>
-          <w:ilvl w:val="0"/>
-          <w:numId w:val="16"/>
-        </w:numPr>
-      </w:pPr>
-      <w:r>
-        <w:t xml:space="preserve">structured resume JSON (canonical) </w:t>
-      </w:r>
-    </w:p>
-    <w:p>
-      <w:pPr>
-        <w:numPr>
-          <w:ilvl w:val="0"/>
-          <w:numId w:val="16"/>
-        </w:numPr>
-      </w:pPr>
-      <w:r>
-        <w:t xml:space="preserve">AI resume tailoring (Gemini API key) </w:t>
-      </w:r>
-    </w:p>
-    <w:p>
-      <w:pPr>
-        <w:numPr>
-          <w:ilvl w:val="0"/>
-          <w:numId w:val="16"/>
+        <w:t>Deferred Features</w:t>
+      </w:r>
+    </w:p>
+    <w:p>
+      <w:pPr>
+        <w:numPr>
+          <w:ilvl w:val="0"/>
+          <w:numId w:val="20"/>
+        </w:numPr>
+      </w:pPr>
+      <w:r>
+        <w:t xml:space="preserve">browser extension integration </w:t>
+      </w:r>
+    </w:p>
+    <w:p>
+      <w:pPr>
+        <w:numPr>
+          <w:ilvl w:val="0"/>
+          <w:numId w:val="20"/>
+        </w:numPr>
+      </w:pPr>
+      <w:r>
+        <w:t xml:space="preserve">LinkedIn import automation </w:t>
+      </w:r>
+    </w:p>
+    <w:p>
+      <w:pPr>
+        <w:numPr>
+          <w:ilvl w:val="0"/>
+          <w:numId w:val="20"/>
+        </w:numPr>
+      </w:pPr>
+      <w:r>
+        <w:t xml:space="preserve">advanced analytics dashboards </w:t>
+      </w:r>
+    </w:p>
+    <w:p>
+      <w:pPr>
+        <w:numPr>
+          <w:ilvl w:val="0"/>
+          <w:numId w:val="20"/>
+        </w:numPr>
+      </w:pPr>
+      <w:r>
+        <w:t xml:space="preserve">multi-device sync enforcement </w:t>
+      </w:r>
+    </w:p>
+    <w:p>
+      <w:pPr>
+        <w:numPr>
+          <w:ilvl w:val="0"/>
+          <w:numId w:val="20"/>
+        </w:numPr>
+      </w:pPr>
+      <w:r>
+        <w:t xml:space="preserve">predictive job matching </w:t>
+      </w:r>
+    </w:p>
+    <w:p>
+      <w:pPr>
+        <w:numPr>
+          <w:ilvl w:val="0"/>
+          <w:numId w:val="20"/>
+        </w:numPr>
+      </w:pPr>
+      <w:r>
+        <w:t xml:space="preserve">recommendation engine </w:t>
+      </w:r>
+    </w:p>
+    <w:p>
+      <w:r>
+        <w:pict w14:anchorId="6A230405">
+          <v:rect id="_x0000_i1095" style="width:0;height:1.5pt" o:hralign="center" o:hrstd="t" o:hr="t" fillcolor="#a0a0a0" stroked="f"/>
+        </w:pict>
+      </w:r>
+    </w:p>
+    <w:p>
+      <w:pPr>
+        <w:rPr>
+          <w:b/>
+          <w:bCs/>
+        </w:rPr>
+      </w:pPr>
+      <w:r>
+        <w:rPr>
+          <w:b/>
+          <w:bCs/>
+        </w:rPr>
+        <w:t>Excluded Features</w:t>
+      </w:r>
+    </w:p>
+    <w:p>
+      <w:pPr>
+        <w:numPr>
+          <w:ilvl w:val="0"/>
+          <w:numId w:val="21"/>
+        </w:numPr>
+      </w:pPr>
+      <w:r>
+        <w:t xml:space="preserve">auto-apply to jobs </w:t>
+      </w:r>
+    </w:p>
+    <w:p>
+      <w:pPr>
+        <w:numPr>
+          <w:ilvl w:val="0"/>
+          <w:numId w:val="21"/>
+        </w:numPr>
+      </w:pPr>
+      <w:r>
+        <w:t xml:space="preserve">recruiter dashboards </w:t>
+      </w:r>
+    </w:p>
+    <w:p>
+      <w:pPr>
+        <w:numPr>
+          <w:ilvl w:val="0"/>
+          <w:numId w:val="21"/>
+        </w:numPr>
+      </w:pPr>
+      <w:r>
+        <w:t xml:space="preserve">messaging system </w:t>
+      </w:r>
+    </w:p>
+    <w:p>
+      <w:pPr>
+        <w:numPr>
+          <w:ilvl w:val="0"/>
+          <w:numId w:val="21"/>
+        </w:numPr>
+      </w:pPr>
+      <w:r>
+        <w:t xml:space="preserve">social networking layer </w:t>
+      </w:r>
+    </w:p>
+    <w:p>
+      <w:pPr>
+        <w:numPr>
+          <w:ilvl w:val="0"/>
+          <w:numId w:val="21"/>
+        </w:numPr>
+      </w:pPr>
+      <w:r>
+        <w:t xml:space="preserve">autonomous AI agents </w:t>
+      </w:r>
+    </w:p>
+    <w:p>
+      <w:r>
+        <w:pict w14:anchorId="5C5E26FB">
+          <v:rect id="_x0000_i1096" style="width:0;height:1.5pt" o:hralign="center" o:hrstd="t" o:hr="t" fillcolor="#a0a0a0" stroked="f"/>
+        </w:pict>
+      </w:r>
+    </w:p>
+    <w:p>
+      <w:pPr>
+        <w:rPr>
+          <w:b/>
+          <w:bCs/>
+        </w:rPr>
+      </w:pPr>
+      <w:r>
+        <w:rPr>
+          <w:b/>
+          <w:bCs/>
+        </w:rPr>
+        <w:t>7. Core User Flows</w:t>
+      </w:r>
+    </w:p>
+    <w:p>
+      <w:pPr>
+        <w:rPr>
+          <w:b/>
+          <w:bCs/>
+        </w:rPr>
+      </w:pPr>
+      <w:r>
+        <w:rPr>
+          <w:b/>
+          <w:bCs/>
+        </w:rPr>
+        <w:t>Onboarding Flow</w:t>
+      </w:r>
+    </w:p>
+    <w:p>
+      <w:pPr>
+        <w:numPr>
+          <w:ilvl w:val="0"/>
+          <w:numId w:val="22"/>
+        </w:numPr>
+      </w:pPr>
+      <w:r>
+        <w:t xml:space="preserve">User installs desktop agent </w:t>
+      </w:r>
+    </w:p>
+    <w:p>
+      <w:pPr>
+        <w:numPr>
+          <w:ilvl w:val="0"/>
+          <w:numId w:val="22"/>
         </w:numPr>
       </w:pPr>
       <w:r>
         <w:lastRenderedPageBreak/>
-        <w:t xml:space="preserve">cover letter generation </w:t>
-      </w:r>
-    </w:p>
-    <w:p>
-      <w:pPr>
-        <w:numPr>
-          <w:ilvl w:val="0"/>
-          <w:numId w:val="16"/>
-        </w:numPr>
-      </w:pPr>
-      <w:r>
-        <w:t xml:space="preserve">template-based PDF rendering </w:t>
+        <w:t xml:space="preserve">Connects cloud account </w:t>
+      </w:r>
+    </w:p>
+    <w:p>
+      <w:pPr>
+        <w:numPr>
+          <w:ilvl w:val="0"/>
+          <w:numId w:val="22"/>
+        </w:numPr>
+      </w:pPr>
+      <w:r>
+        <w:t xml:space="preserve">Inputs Gemini API key locally </w:t>
+      </w:r>
+    </w:p>
+    <w:p>
+      <w:pPr>
+        <w:numPr>
+          <w:ilvl w:val="0"/>
+          <w:numId w:val="22"/>
+        </w:numPr>
+      </w:pPr>
+      <w:r>
+        <w:t xml:space="preserve">Defines job preferences </w:t>
+      </w:r>
+    </w:p>
+    <w:p>
+      <w:pPr>
+        <w:numPr>
+          <w:ilvl w:val="0"/>
+          <w:numId w:val="22"/>
+        </w:numPr>
+      </w:pPr>
+      <w:r>
+        <w:t xml:space="preserve">System begins scraping cycle </w:t>
+      </w:r>
+    </w:p>
+    <w:p>
+      <w:r>
+        <w:pict w14:anchorId="230A4BFE">
+          <v:rect id="_x0000_i1097" style="width:0;height:1.5pt" o:hralign="center" o:hrstd="t" o:hr="t" fillcolor="#a0a0a0" stroked="f"/>
+        </w:pict>
+      </w:r>
+    </w:p>
+    <w:p>
+      <w:pPr>
+        <w:rPr>
+          <w:b/>
+          <w:bCs/>
+        </w:rPr>
+      </w:pPr>
+      <w:r>
+        <w:rPr>
+          <w:b/>
+          <w:bCs/>
+        </w:rPr>
+        <w:t>Primary Workflow</w:t>
+      </w:r>
+    </w:p>
+    <w:p>
+      <w:pPr>
+        <w:rPr>
+          <w:b/>
+          <w:bCs/>
+        </w:rPr>
+      </w:pPr>
+      <w:r>
+        <w:rPr>
+          <w:b/>
+          <w:bCs/>
+        </w:rPr>
+        <w:t>Job Discovery Pipeline</w:t>
+      </w:r>
+    </w:p>
+    <w:p>
+      <w:r>
+        <w:t>scrape → normalize → deduplicate → score → store</w:t>
+      </w:r>
+    </w:p>
+    <w:p>
+      <w:pPr>
+        <w:rPr>
+          <w:b/>
+          <w:bCs/>
+        </w:rPr>
+      </w:pPr>
+      <w:r>
+        <w:rPr>
+          <w:b/>
+          <w:bCs/>
+        </w:rPr>
+        <w:t>Resume Pipeline</w:t>
+      </w:r>
+    </w:p>
+    <w:p>
+      <w:r>
+        <w:t>job selected → resume JSON generated → AI tailoring → validation → PDF export</w:t>
       </w:r>
     </w:p>
     <w:p>
@@ -1128,182 +1636,14 @@
       </w:r>
     </w:p>
     <w:p>
-      <w:pPr>
-        <w:numPr>
-          <w:ilvl w:val="0"/>
-          <w:numId w:val="17"/>
-        </w:numPr>
-      </w:pPr>
-      <w:r>
-        <w:t xml:space="preserve">manual + assisted status updates </w:t>
-      </w:r>
-    </w:p>
-    <w:p>
-      <w:pPr>
-        <w:numPr>
-          <w:ilvl w:val="0"/>
-          <w:numId w:val="17"/>
-        </w:numPr>
-      </w:pPr>
-      <w:r>
-        <w:t xml:space="preserve">timeline tracking </w:t>
-      </w:r>
-    </w:p>
-    <w:p>
-      <w:pPr>
-        <w:numPr>
-          <w:ilvl w:val="0"/>
-          <w:numId w:val="17"/>
-        </w:numPr>
-      </w:pPr>
-      <w:r>
-        <w:t xml:space="preserve">notes per application </w:t>
-      </w:r>
-    </w:p>
-    <w:p>
-      <w:pPr>
-        <w:rPr>
-          <w:b/>
-          <w:bCs/>
-        </w:rPr>
-      </w:pPr>
-      <w:r>
-        <w:rPr>
-          <w:b/>
-          <w:bCs/>
-        </w:rPr>
-        <w:t>Local Agent</w:t>
-      </w:r>
-    </w:p>
-    <w:p>
-      <w:pPr>
-        <w:numPr>
-          <w:ilvl w:val="0"/>
-          <w:numId w:val="18"/>
-        </w:numPr>
-      </w:pPr>
-      <w:r>
-        <w:t xml:space="preserve">Playwright scraping runtime </w:t>
-      </w:r>
-    </w:p>
-    <w:p>
-      <w:pPr>
-        <w:numPr>
-          <w:ilvl w:val="0"/>
-          <w:numId w:val="18"/>
-        </w:numPr>
-      </w:pPr>
-      <w:r>
-        <w:t xml:space="preserve">AI execution orchestration </w:t>
-      </w:r>
-    </w:p>
-    <w:p>
-      <w:pPr>
-        <w:numPr>
-          <w:ilvl w:val="0"/>
-          <w:numId w:val="18"/>
-        </w:numPr>
-      </w:pPr>
-      <w:r>
-        <w:t xml:space="preserve">local queue system </w:t>
-      </w:r>
-    </w:p>
-    <w:p>
-      <w:pPr>
-        <w:numPr>
-          <w:ilvl w:val="0"/>
-          <w:numId w:val="18"/>
-        </w:numPr>
-      </w:pPr>
-      <w:r>
-        <w:t xml:space="preserve">event log storage </w:t>
-      </w:r>
-    </w:p>
-    <w:p>
-      <w:pPr>
-        <w:numPr>
-          <w:ilvl w:val="0"/>
-          <w:numId w:val="18"/>
-        </w:numPr>
-      </w:pPr>
-      <w:r>
-        <w:t xml:space="preserve">sync batching </w:t>
-      </w:r>
-    </w:p>
-    <w:p>
-      <w:pPr>
-        <w:rPr>
-          <w:b/>
-          <w:bCs/>
-        </w:rPr>
-      </w:pPr>
-      <w:r>
-        <w:rPr>
-          <w:b/>
-          <w:bCs/>
-        </w:rPr>
-        <w:t>Cloud Backend</w:t>
-      </w:r>
-    </w:p>
-    <w:p>
-      <w:pPr>
-        <w:numPr>
-          <w:ilvl w:val="0"/>
-          <w:numId w:val="19"/>
-        </w:numPr>
-      </w:pPr>
-      <w:r>
-        <w:t xml:space="preserve">user data storage </w:t>
-      </w:r>
-    </w:p>
-    <w:p>
-      <w:pPr>
-        <w:numPr>
-          <w:ilvl w:val="0"/>
-          <w:numId w:val="19"/>
-        </w:numPr>
-      </w:pPr>
-      <w:r>
-        <w:t xml:space="preserve">job storage </w:t>
-      </w:r>
-    </w:p>
-    <w:p>
-      <w:pPr>
-        <w:numPr>
-          <w:ilvl w:val="0"/>
-          <w:numId w:val="19"/>
-        </w:numPr>
-      </w:pPr>
-      <w:r>
-        <w:t xml:space="preserve">resume storage </w:t>
-      </w:r>
-    </w:p>
-    <w:p>
-      <w:pPr>
-        <w:numPr>
-          <w:ilvl w:val="0"/>
-          <w:numId w:val="19"/>
-        </w:numPr>
-      </w:pPr>
-      <w:r>
-        <w:t xml:space="preserve">analytics aggregation </w:t>
-      </w:r>
-    </w:p>
-    <w:p>
-      <w:pPr>
-        <w:numPr>
-          <w:ilvl w:val="0"/>
-          <w:numId w:val="19"/>
-        </w:numPr>
-      </w:pPr>
-      <w:r>
-        <w:t xml:space="preserve">sync ingestion API </w:t>
-      </w:r>
-    </w:p>
-    <w:p>
-      <w:r>
-        <w:pict w14:anchorId="3549C54E">
-          <v:rect id="_x0000_i1164" style="width:0;height:1.5pt" o:hralign="center" o:hrstd="t" o:hr="t" fillcolor="#a0a0a0" stroked="f"/>
+      <w:r>
+        <w:t>user submits application → status updated → timeline tracked → outcome recorded</w:t>
+      </w:r>
+    </w:p>
+    <w:p>
+      <w:r>
+        <w:pict w14:anchorId="5D121CD3">
+          <v:rect id="_x0000_i1098" style="width:0;height:1.5pt" o:hralign="center" o:hrstd="t" o:hr="t" fillcolor="#a0a0a0" stroked="f"/>
         </w:pict>
       </w:r>
     </w:p>
@@ -1319,79 +1659,57 @@
           <w:b/>
           <w:bCs/>
         </w:rPr>
-        <w:t>Deferred Features</w:t>
-      </w:r>
-    </w:p>
-    <w:p>
-      <w:pPr>
-        <w:numPr>
-          <w:ilvl w:val="0"/>
-          <w:numId w:val="20"/>
-        </w:numPr>
-      </w:pPr>
-      <w:r>
-        <w:t xml:space="preserve">browser extension integration </w:t>
-      </w:r>
-    </w:p>
-    <w:p>
-      <w:pPr>
-        <w:numPr>
-          <w:ilvl w:val="0"/>
-          <w:numId w:val="20"/>
-        </w:numPr>
-      </w:pPr>
-      <w:r>
-        <w:t xml:space="preserve">LinkedIn import automation </w:t>
-      </w:r>
-    </w:p>
-    <w:p>
-      <w:pPr>
-        <w:numPr>
-          <w:ilvl w:val="0"/>
-          <w:numId w:val="20"/>
-        </w:numPr>
-      </w:pPr>
-      <w:r>
-        <w:t xml:space="preserve">advanced analytics dashboards </w:t>
-      </w:r>
-    </w:p>
-    <w:p>
-      <w:pPr>
-        <w:numPr>
-          <w:ilvl w:val="0"/>
-          <w:numId w:val="20"/>
-        </w:numPr>
-      </w:pPr>
-      <w:r>
-        <w:t xml:space="preserve">multi-device sync enforcement </w:t>
-      </w:r>
-    </w:p>
-    <w:p>
-      <w:pPr>
-        <w:numPr>
-          <w:ilvl w:val="0"/>
-          <w:numId w:val="20"/>
-        </w:numPr>
-      </w:pPr>
-      <w:r>
-        <w:t xml:space="preserve">predictive job matching </w:t>
-      </w:r>
-    </w:p>
-    <w:p>
-      <w:pPr>
-        <w:numPr>
-          <w:ilvl w:val="0"/>
-          <w:numId w:val="20"/>
-        </w:numPr>
-      </w:pPr>
-      <w:r>
-        <w:t xml:space="preserve">recommendation engine </w:t>
-      </w:r>
-    </w:p>
-    <w:p>
-      <w:r>
-        <w:pict w14:anchorId="6A230405">
-          <v:rect id="_x0000_i1165" style="width:0;height:1.5pt" o:hralign="center" o:hrstd="t" o:hr="t" fillcolor="#a0a0a0" stroked="f"/>
+        <w:t>Failure Scenarios</w:t>
+      </w:r>
+    </w:p>
+    <w:p>
+      <w:pPr>
+        <w:numPr>
+          <w:ilvl w:val="0"/>
+          <w:numId w:val="23"/>
+        </w:numPr>
+      </w:pPr>
+      <w:r>
+        <w:t xml:space="preserve">scraper blocked → retry capped + quarantine </w:t>
+      </w:r>
+    </w:p>
+    <w:p>
+      <w:pPr>
+        <w:numPr>
+          <w:ilvl w:val="0"/>
+          <w:numId w:val="23"/>
+        </w:numPr>
+      </w:pPr>
+      <w:r>
+        <w:t xml:space="preserve">AI failure → fallback provider + retry limit </w:t>
+      </w:r>
+    </w:p>
+    <w:p>
+      <w:pPr>
+        <w:numPr>
+          <w:ilvl w:val="0"/>
+          <w:numId w:val="23"/>
+        </w:numPr>
+      </w:pPr>
+      <w:r>
+        <w:t xml:space="preserve">sync failure → local queue throttling </w:t>
+      </w:r>
+    </w:p>
+    <w:p>
+      <w:pPr>
+        <w:numPr>
+          <w:ilvl w:val="0"/>
+          <w:numId w:val="23"/>
+        </w:numPr>
+      </w:pPr>
+      <w:r>
+        <w:t xml:space="preserve">schema mismatch → version migration or quarantine </w:t>
+      </w:r>
+    </w:p>
+    <w:p>
+      <w:r>
+        <w:pict w14:anchorId="1AE8A46B">
+          <v:rect id="_x0000_i1099" style="width:0;height:1.5pt" o:hralign="center" o:hrstd="t" o:hr="t" fillcolor="#a0a0a0" stroked="f"/>
         </w:pict>
       </w:r>
     </w:p>
@@ -1407,324 +1725,6 @@
           <w:b/>
           <w:bCs/>
         </w:rPr>
-        <w:t>Excluded Features</w:t>
-      </w:r>
-    </w:p>
-    <w:p>
-      <w:pPr>
-        <w:numPr>
-          <w:ilvl w:val="0"/>
-          <w:numId w:val="21"/>
-        </w:numPr>
-      </w:pPr>
-      <w:r>
-        <w:t xml:space="preserve">auto-apply to jobs </w:t>
-      </w:r>
-    </w:p>
-    <w:p>
-      <w:pPr>
-        <w:numPr>
-          <w:ilvl w:val="0"/>
-          <w:numId w:val="21"/>
-        </w:numPr>
-      </w:pPr>
-      <w:r>
-        <w:t xml:space="preserve">recruiter dashboards </w:t>
-      </w:r>
-    </w:p>
-    <w:p>
-      <w:pPr>
-        <w:numPr>
-          <w:ilvl w:val="0"/>
-          <w:numId w:val="21"/>
-        </w:numPr>
-      </w:pPr>
-      <w:r>
-        <w:t xml:space="preserve">messaging system </w:t>
-      </w:r>
-    </w:p>
-    <w:p>
-      <w:pPr>
-        <w:numPr>
-          <w:ilvl w:val="0"/>
-          <w:numId w:val="21"/>
-        </w:numPr>
-      </w:pPr>
-      <w:r>
-        <w:t xml:space="preserve">social networking layer </w:t>
-      </w:r>
-    </w:p>
-    <w:p>
-      <w:pPr>
-        <w:numPr>
-          <w:ilvl w:val="0"/>
-          <w:numId w:val="21"/>
-        </w:numPr>
-      </w:pPr>
-      <w:r>
-        <w:t xml:space="preserve">autonomous AI agents </w:t>
-      </w:r>
-    </w:p>
-    <w:p>
-      <w:r>
-        <w:pict w14:anchorId="5C5E26FB">
-          <v:rect id="_x0000_i1166" style="width:0;height:1.5pt" o:hralign="center" o:hrstd="t" o:hr="t" fillcolor="#a0a0a0" stroked="f"/>
-        </w:pict>
-      </w:r>
-    </w:p>
-    <w:p>
-      <w:pPr>
-        <w:rPr>
-          <w:b/>
-          <w:bCs/>
-        </w:rPr>
-      </w:pPr>
-      <w:r>
-        <w:rPr>
-          <w:b/>
-          <w:bCs/>
-        </w:rPr>
-        <w:t>7. Core User Flows</w:t>
-      </w:r>
-    </w:p>
-    <w:p>
-      <w:pPr>
-        <w:rPr>
-          <w:b/>
-          <w:bCs/>
-        </w:rPr>
-      </w:pPr>
-      <w:r>
-        <w:rPr>
-          <w:b/>
-          <w:bCs/>
-        </w:rPr>
-        <w:lastRenderedPageBreak/>
-        <w:t>Onboarding Flow</w:t>
-      </w:r>
-    </w:p>
-    <w:p>
-      <w:pPr>
-        <w:numPr>
-          <w:ilvl w:val="0"/>
-          <w:numId w:val="22"/>
-        </w:numPr>
-      </w:pPr>
-      <w:r>
-        <w:t xml:space="preserve">User installs desktop agent </w:t>
-      </w:r>
-    </w:p>
-    <w:p>
-      <w:pPr>
-        <w:numPr>
-          <w:ilvl w:val="0"/>
-          <w:numId w:val="22"/>
-        </w:numPr>
-      </w:pPr>
-      <w:r>
-        <w:t xml:space="preserve">Connects cloud account </w:t>
-      </w:r>
-    </w:p>
-    <w:p>
-      <w:pPr>
-        <w:numPr>
-          <w:ilvl w:val="0"/>
-          <w:numId w:val="22"/>
-        </w:numPr>
-      </w:pPr>
-      <w:r>
-        <w:t xml:space="preserve">Inputs Gemini API key locally </w:t>
-      </w:r>
-    </w:p>
-    <w:p>
-      <w:pPr>
-        <w:numPr>
-          <w:ilvl w:val="0"/>
-          <w:numId w:val="22"/>
-        </w:numPr>
-      </w:pPr>
-      <w:r>
-        <w:t xml:space="preserve">Defines job preferences </w:t>
-      </w:r>
-    </w:p>
-    <w:p>
-      <w:pPr>
-        <w:numPr>
-          <w:ilvl w:val="0"/>
-          <w:numId w:val="22"/>
-        </w:numPr>
-      </w:pPr>
-      <w:r>
-        <w:t xml:space="preserve">System begins scraping cycle </w:t>
-      </w:r>
-    </w:p>
-    <w:p>
-      <w:r>
-        <w:pict w14:anchorId="230A4BFE">
-          <v:rect id="_x0000_i1167" style="width:0;height:1.5pt" o:hralign="center" o:hrstd="t" o:hr="t" fillcolor="#a0a0a0" stroked="f"/>
-        </w:pict>
-      </w:r>
-    </w:p>
-    <w:p>
-      <w:pPr>
-        <w:rPr>
-          <w:b/>
-          <w:bCs/>
-        </w:rPr>
-      </w:pPr>
-      <w:r>
-        <w:rPr>
-          <w:b/>
-          <w:bCs/>
-        </w:rPr>
-        <w:t>Primary Workflow</w:t>
-      </w:r>
-    </w:p>
-    <w:p>
-      <w:pPr>
-        <w:rPr>
-          <w:b/>
-          <w:bCs/>
-        </w:rPr>
-      </w:pPr>
-      <w:r>
-        <w:rPr>
-          <w:b/>
-          <w:bCs/>
-        </w:rPr>
-        <w:t>Job Discovery Pipeline</w:t>
-      </w:r>
-    </w:p>
-    <w:p>
-      <w:r>
-        <w:t>scrape → normalize → deduplicate → score → store</w:t>
-      </w:r>
-    </w:p>
-    <w:p>
-      <w:pPr>
-        <w:rPr>
-          <w:b/>
-          <w:bCs/>
-        </w:rPr>
-      </w:pPr>
-      <w:r>
-        <w:rPr>
-          <w:b/>
-          <w:bCs/>
-        </w:rPr>
-        <w:t>Resume Pipeline</w:t>
-      </w:r>
-    </w:p>
-    <w:p>
-      <w:r>
-        <w:t>job selected → resume JSON generated → AI tailoring → validation → PDF export</w:t>
-      </w:r>
-    </w:p>
-    <w:p>
-      <w:pPr>
-        <w:rPr>
-          <w:b/>
-          <w:bCs/>
-        </w:rPr>
-      </w:pPr>
-      <w:r>
-        <w:rPr>
-          <w:b/>
-          <w:bCs/>
-        </w:rPr>
-        <w:t>Application Tracking</w:t>
-      </w:r>
-    </w:p>
-    <w:p>
-      <w:r>
-        <w:t>user submits application → status updated → timeline tracked → outcome recorded</w:t>
-      </w:r>
-    </w:p>
-    <w:p>
-      <w:r>
-        <w:pict w14:anchorId="5D121CD3">
-          <v:rect id="_x0000_i1168" style="width:0;height:1.5pt" o:hralign="center" o:hrstd="t" o:hr="t" fillcolor="#a0a0a0" stroked="f"/>
-        </w:pict>
-      </w:r>
-    </w:p>
-    <w:p>
-      <w:pPr>
-        <w:rPr>
-          <w:b/>
-          <w:bCs/>
-        </w:rPr>
-      </w:pPr>
-      <w:r>
-        <w:rPr>
-          <w:b/>
-          <w:bCs/>
-        </w:rPr>
-        <w:t>Failure Scenarios</w:t>
-      </w:r>
-    </w:p>
-    <w:p>
-      <w:pPr>
-        <w:numPr>
-          <w:ilvl w:val="0"/>
-          <w:numId w:val="23"/>
-        </w:numPr>
-      </w:pPr>
-      <w:r>
-        <w:t xml:space="preserve">scraper blocked → retry capped + quarantine </w:t>
-      </w:r>
-    </w:p>
-    <w:p>
-      <w:pPr>
-        <w:numPr>
-          <w:ilvl w:val="0"/>
-          <w:numId w:val="23"/>
-        </w:numPr>
-      </w:pPr>
-      <w:r>
-        <w:t xml:space="preserve">AI failure → fallback provider + retry limit </w:t>
-      </w:r>
-    </w:p>
-    <w:p>
-      <w:pPr>
-        <w:numPr>
-          <w:ilvl w:val="0"/>
-          <w:numId w:val="23"/>
-        </w:numPr>
-      </w:pPr>
-      <w:r>
-        <w:t xml:space="preserve">sync failure → local queue throttling </w:t>
-      </w:r>
-    </w:p>
-    <w:p>
-      <w:pPr>
-        <w:numPr>
-          <w:ilvl w:val="0"/>
-          <w:numId w:val="23"/>
-        </w:numPr>
-      </w:pPr>
-      <w:r>
-        <w:t xml:space="preserve">schema mismatch → version migration or quarantine </w:t>
-      </w:r>
-    </w:p>
-    <w:p>
-      <w:r>
-        <w:pict w14:anchorId="1AE8A46B">
-          <v:rect id="_x0000_i1169" style="width:0;height:1.5pt" o:hralign="center" o:hrstd="t" o:hr="t" fillcolor="#a0a0a0" stroked="f"/>
-        </w:pict>
-      </w:r>
-    </w:p>
-    <w:p>
-      <w:pPr>
-        <w:rPr>
-          <w:b/>
-          <w:bCs/>
-        </w:rPr>
-      </w:pPr>
-      <w:r>
-        <w:rPr>
-          <w:b/>
-          <w:bCs/>
-        </w:rPr>
         <w:t>Repeat Loop</w:t>
       </w:r>
     </w:p>
@@ -1764,7 +1764,7 @@
     <w:p>
       <w:r>
         <w:pict w14:anchorId="69F86793">
-          <v:rect id="_x0000_i1170" style="width:0;height:1.5pt" o:hralign="center" o:hrstd="t" o:hr="t" fillcolor="#a0a0a0" stroked="f"/>
+          <v:rect id="_x0000_i1100" style="width:0;height:1.5pt" o:hralign="center" o:hrstd="t" o:hr="t" fillcolor="#a0a0a0" stroked="f"/>
         </w:pict>
       </w:r>
     </w:p>
@@ -1887,7 +1887,6 @@
         </w:numPr>
       </w:pPr>
       <w:r>
-        <w:lastRenderedPageBreak/>
         <w:t xml:space="preserve">skills match </w:t>
       </w:r>
     </w:p>
@@ -1910,6 +1909,7 @@
         </w:numPr>
       </w:pPr>
       <w:r>
+        <w:lastRenderedPageBreak/>
         <w:t xml:space="preserve">seniority alignment </w:t>
       </w:r>
     </w:p>
@@ -2115,7 +2115,7 @@
     <w:p>
       <w:r>
         <w:pict w14:anchorId="79AA4FE9">
-          <v:rect id="_x0000_i1171" style="width:0;height:1.5pt" o:hralign="center" o:hrstd="t" o:hr="t" fillcolor="#a0a0a0" stroked="f"/>
+          <v:rect id="_x0000_i1101" style="width:0;height:1.5pt" o:hralign="center" o:hrstd="t" o:hr="t" fillcolor="#a0a0a0" stroked="f"/>
         </w:pict>
       </w:r>
     </w:p>
@@ -2301,41 +2301,41 @@
         </w:numPr>
       </w:pPr>
       <w:r>
+        <w:t xml:space="preserve">designed for 1k </w:t>
+      </w:r>
+      <w:proofErr w:type="gramStart"/>
+      <w:r>
+        <w:t>users</w:t>
+      </w:r>
+      <w:proofErr w:type="gramEnd"/>
+      <w:r>
+        <w:t xml:space="preserve"> max initial target </w:t>
+      </w:r>
+    </w:p>
+    <w:p>
+      <w:pPr>
+        <w:numPr>
+          <w:ilvl w:val="0"/>
+          <w:numId w:val="33"/>
+        </w:numPr>
+      </w:pPr>
+      <w:r>
+        <w:t xml:space="preserve">batch sync preferred over real-time streaming </w:t>
+      </w:r>
+    </w:p>
+    <w:p>
+      <w:pPr>
+        <w:rPr>
+          <w:b/>
+          <w:bCs/>
+        </w:rPr>
+      </w:pPr>
+      <w:r>
+        <w:rPr>
+          <w:b/>
+          <w:bCs/>
+        </w:rPr>
         <w:lastRenderedPageBreak/>
-        <w:t xml:space="preserve">designed for 1k </w:t>
-      </w:r>
-      <w:proofErr w:type="gramStart"/>
-      <w:r>
-        <w:t>users</w:t>
-      </w:r>
-      <w:proofErr w:type="gramEnd"/>
-      <w:r>
-        <w:t xml:space="preserve"> max initial target </w:t>
-      </w:r>
-    </w:p>
-    <w:p>
-      <w:pPr>
-        <w:numPr>
-          <w:ilvl w:val="0"/>
-          <w:numId w:val="33"/>
-        </w:numPr>
-      </w:pPr>
-      <w:r>
-        <w:t xml:space="preserve">batch sync preferred over real-time streaming </w:t>
-      </w:r>
-    </w:p>
-    <w:p>
-      <w:pPr>
-        <w:rPr>
-          <w:b/>
-          <w:bCs/>
-        </w:rPr>
-      </w:pPr>
-      <w:r>
-        <w:rPr>
-          <w:b/>
-          <w:bCs/>
-        </w:rPr>
         <w:t>Observability</w:t>
       </w:r>
     </w:p>
@@ -2419,7 +2419,7 @@
     <w:p>
       <w:r>
         <w:pict w14:anchorId="15C891DC">
-          <v:rect id="_x0000_i1172" style="width:0;height:1.5pt" o:hralign="center" o:hrstd="t" o:hr="t" fillcolor="#a0a0a0" stroked="f"/>
+          <v:rect id="_x0000_i1102" style="width:0;height:1.5pt" o:hralign="center" o:hrstd="t" o:hr="t" fillcolor="#a0a0a0" stroked="f"/>
         </w:pict>
       </w:r>
     </w:p>
@@ -2674,7 +2674,7 @@
     <w:p>
       <w:r>
         <w:pict w14:anchorId="4A907445">
-          <v:rect id="_x0000_i1173" style="width:0;height:1.5pt" o:hralign="center" o:hrstd="t" o:hr="t" fillcolor="#a0a0a0" stroked="f"/>
+          <v:rect id="_x0000_i1103" style="width:0;height:1.5pt" o:hralign="center" o:hrstd="t" o:hr="t" fillcolor="#a0a0a0" stroked="f"/>
         </w:pict>
       </w:r>
     </w:p>
@@ -2716,33 +2716,33 @@
         </w:numPr>
       </w:pPr>
       <w:r>
+        <w:t xml:space="preserve">user owns all job and resume data </w:t>
+      </w:r>
+    </w:p>
+    <w:p>
+      <w:pPr>
+        <w:numPr>
+          <w:ilvl w:val="0"/>
+          <w:numId w:val="40"/>
+        </w:numPr>
+      </w:pPr>
+      <w:r>
+        <w:t xml:space="preserve">cloud stores projections only </w:t>
+      </w:r>
+    </w:p>
+    <w:p>
+      <w:pPr>
+        <w:rPr>
+          <w:b/>
+          <w:bCs/>
+        </w:rPr>
+      </w:pPr>
+      <w:r>
+        <w:rPr>
+          <w:b/>
+          <w:bCs/>
+        </w:rPr>
         <w:lastRenderedPageBreak/>
-        <w:t xml:space="preserve">user owns all job and resume data </w:t>
-      </w:r>
-    </w:p>
-    <w:p>
-      <w:pPr>
-        <w:numPr>
-          <w:ilvl w:val="0"/>
-          <w:numId w:val="40"/>
-        </w:numPr>
-      </w:pPr>
-      <w:r>
-        <w:t xml:space="preserve">cloud stores projections only </w:t>
-      </w:r>
-    </w:p>
-    <w:p>
-      <w:pPr>
-        <w:rPr>
-          <w:b/>
-          <w:bCs/>
-        </w:rPr>
-      </w:pPr>
-      <w:r>
-        <w:rPr>
-          <w:b/>
-          <w:bCs/>
-        </w:rPr>
         <w:t>Retention</w:t>
       </w:r>
     </w:p>
@@ -2845,7 +2845,7 @@
     <w:p>
       <w:r>
         <w:pict w14:anchorId="22C9629F">
-          <v:rect id="_x0000_i1174" style="width:0;height:1.5pt" o:hralign="center" o:hrstd="t" o:hr="t" fillcolor="#a0a0a0" stroked="f"/>
+          <v:rect id="_x0000_i1104" style="width:0;height:1.5pt" o:hralign="center" o:hrstd="t" o:hr="t" fillcolor="#a0a0a0" stroked="f"/>
         </w:pict>
       </w:r>
     </w:p>
@@ -3037,7 +3037,7 @@
     <w:p>
       <w:r>
         <w:pict w14:anchorId="22D9224A">
-          <v:rect id="_x0000_i1175" style="width:0;height:1.5pt" o:hralign="center" o:hrstd="t" o:hr="t" fillcolor="#a0a0a0" stroked="f"/>
+          <v:rect id="_x0000_i1105" style="width:0;height:1.5pt" o:hralign="center" o:hrstd="t" o:hr="t" fillcolor="#a0a0a0" stroked="f"/>
         </w:pict>
       </w:r>
     </w:p>
@@ -3124,9 +3124,223 @@
     </w:p>
     <w:p>
       <w:r>
+        <w:pict w14:anchorId="7F053105">
+          <v:rect id="_x0000_i1106" style="width:0;height:1.5pt" o:hralign="center" o:hrstd="t" o:hr="t" fillcolor="#a0a0a0" stroked="f"/>
+        </w:pict>
+      </w:r>
+    </w:p>
+    <w:p>
+      <w:pPr>
+        <w:rPr>
+          <w:b/>
+          <w:bCs/>
+        </w:rPr>
+      </w:pPr>
+      <w:r>
+        <w:rPr>
+          <w:b/>
+          <w:bCs/>
+        </w:rPr>
+        <w:t>14. Risks &amp; Constraints</w:t>
+      </w:r>
+    </w:p>
+    <w:p>
+      <w:pPr>
+        <w:rPr>
+          <w:b/>
+          <w:bCs/>
+        </w:rPr>
+      </w:pPr>
+      <w:r>
+        <w:rPr>
+          <w:b/>
+          <w:bCs/>
+        </w:rPr>
         <w:lastRenderedPageBreak/>
-        <w:pict w14:anchorId="7F053105">
-          <v:rect id="_x0000_i1176" style="width:0;height:1.5pt" o:hralign="center" o:hrstd="t" o:hr="t" fillcolor="#a0a0a0" stroked="f"/>
+        <w:t>Technical Risks</w:t>
+      </w:r>
+    </w:p>
+    <w:p>
+      <w:pPr>
+        <w:numPr>
+          <w:ilvl w:val="0"/>
+          <w:numId w:val="49"/>
+        </w:numPr>
+      </w:pPr>
+      <w:r>
+        <w:t xml:space="preserve">scraper brittleness (ATS changes) </w:t>
+      </w:r>
+    </w:p>
+    <w:p>
+      <w:pPr>
+        <w:numPr>
+          <w:ilvl w:val="0"/>
+          <w:numId w:val="49"/>
+        </w:numPr>
+      </w:pPr>
+      <w:r>
+        <w:t xml:space="preserve">local agent corruption </w:t>
+      </w:r>
+    </w:p>
+    <w:p>
+      <w:pPr>
+        <w:numPr>
+          <w:ilvl w:val="0"/>
+          <w:numId w:val="49"/>
+        </w:numPr>
+      </w:pPr>
+      <w:r>
+        <w:t xml:space="preserve">sync drift between cloud and local </w:t>
+      </w:r>
+    </w:p>
+    <w:p>
+      <w:pPr>
+        <w:numPr>
+          <w:ilvl w:val="0"/>
+          <w:numId w:val="49"/>
+        </w:numPr>
+      </w:pPr>
+      <w:r>
+        <w:t xml:space="preserve">AI retry cost amplification </w:t>
+      </w:r>
+    </w:p>
+    <w:p>
+      <w:pPr>
+        <w:rPr>
+          <w:b/>
+          <w:bCs/>
+        </w:rPr>
+      </w:pPr>
+      <w:r>
+        <w:rPr>
+          <w:b/>
+          <w:bCs/>
+        </w:rPr>
+        <w:t>UX Risks</w:t>
+      </w:r>
+    </w:p>
+    <w:p>
+      <w:pPr>
+        <w:numPr>
+          <w:ilvl w:val="0"/>
+          <w:numId w:val="50"/>
+        </w:numPr>
+      </w:pPr>
+      <w:r>
+        <w:t xml:space="preserve">onboarding complexity (API key requirement) </w:t>
+      </w:r>
+    </w:p>
+    <w:p>
+      <w:pPr>
+        <w:numPr>
+          <w:ilvl w:val="0"/>
+          <w:numId w:val="50"/>
+        </w:numPr>
+      </w:pPr>
+      <w:r>
+        <w:t xml:space="preserve">trust issues in scoring accuracy </w:t>
+      </w:r>
+    </w:p>
+    <w:p>
+      <w:pPr>
+        <w:numPr>
+          <w:ilvl w:val="0"/>
+          <w:numId w:val="50"/>
+        </w:numPr>
+      </w:pPr>
+      <w:r>
+        <w:t xml:space="preserve">perceived inconsistency due to eventual sync </w:t>
+      </w:r>
+    </w:p>
+    <w:p>
+      <w:pPr>
+        <w:rPr>
+          <w:b/>
+          <w:bCs/>
+        </w:rPr>
+      </w:pPr>
+      <w:r>
+        <w:rPr>
+          <w:b/>
+          <w:bCs/>
+        </w:rPr>
+        <w:t>Scaling Risks</w:t>
+      </w:r>
+    </w:p>
+    <w:p>
+      <w:pPr>
+        <w:numPr>
+          <w:ilvl w:val="0"/>
+          <w:numId w:val="51"/>
+        </w:numPr>
+      </w:pPr>
+      <w:r>
+        <w:t xml:space="preserve">queue backlog explosion offline </w:t>
+      </w:r>
+    </w:p>
+    <w:p>
+      <w:pPr>
+        <w:numPr>
+          <w:ilvl w:val="0"/>
+          <w:numId w:val="51"/>
+        </w:numPr>
+      </w:pPr>
+      <w:r>
+        <w:t xml:space="preserve">AI request duplication (&lt;1% acceptable threshold) </w:t>
+      </w:r>
+    </w:p>
+    <w:p>
+      <w:pPr>
+        <w:numPr>
+          <w:ilvl w:val="0"/>
+          <w:numId w:val="51"/>
+        </w:numPr>
+      </w:pPr>
+      <w:r>
+        <w:t xml:space="preserve">storage growth from logs </w:t>
+      </w:r>
+    </w:p>
+    <w:p>
+      <w:pPr>
+        <w:rPr>
+          <w:b/>
+          <w:bCs/>
+        </w:rPr>
+      </w:pPr>
+      <w:r>
+        <w:rPr>
+          <w:b/>
+          <w:bCs/>
+        </w:rPr>
+        <w:t>Business Risks</w:t>
+      </w:r>
+    </w:p>
+    <w:p>
+      <w:pPr>
+        <w:numPr>
+          <w:ilvl w:val="0"/>
+          <w:numId w:val="52"/>
+        </w:numPr>
+      </w:pPr>
+      <w:r>
+        <w:t xml:space="preserve">reliance on user-provided AI keys </w:t>
+      </w:r>
+    </w:p>
+    <w:p>
+      <w:pPr>
+        <w:numPr>
+          <w:ilvl w:val="0"/>
+          <w:numId w:val="52"/>
+        </w:numPr>
+      </w:pPr>
+      <w:r>
+        <w:t xml:space="preserve">dependency on external ATS stability </w:t>
+      </w:r>
+    </w:p>
+    <w:p>
+      <w:r>
+        <w:pict w14:anchorId="0536793E">
+          <v:rect id="_x0000_i1107" style="width:0;height:1.5pt" o:hralign="center" o:hrstd="t" o:hr="t" fillcolor="#a0a0a0" stroked="f"/>
         </w:pict>
       </w:r>
     </w:p>
@@ -3142,205 +3356,90 @@
           <w:b/>
           <w:bCs/>
         </w:rPr>
-        <w:t>14. Risks &amp; Constraints</w:t>
-      </w:r>
-    </w:p>
-    <w:p>
-      <w:pPr>
-        <w:rPr>
-          <w:b/>
-          <w:bCs/>
-        </w:rPr>
-      </w:pPr>
-      <w:r>
-        <w:rPr>
-          <w:b/>
-          <w:bCs/>
-        </w:rPr>
-        <w:t>Technical Risks</w:t>
-      </w:r>
-    </w:p>
-    <w:p>
-      <w:pPr>
-        <w:numPr>
-          <w:ilvl w:val="0"/>
-          <w:numId w:val="49"/>
-        </w:numPr>
-      </w:pPr>
-      <w:r>
-        <w:t xml:space="preserve">scraper brittleness (ATS changes) </w:t>
-      </w:r>
-    </w:p>
-    <w:p>
-      <w:pPr>
-        <w:numPr>
-          <w:ilvl w:val="0"/>
-          <w:numId w:val="49"/>
-        </w:numPr>
-      </w:pPr>
-      <w:r>
-        <w:t xml:space="preserve">local agent corruption </w:t>
-      </w:r>
-    </w:p>
-    <w:p>
-      <w:pPr>
-        <w:numPr>
-          <w:ilvl w:val="0"/>
-          <w:numId w:val="49"/>
-        </w:numPr>
-      </w:pPr>
-      <w:r>
-        <w:t xml:space="preserve">sync drift between cloud and local </w:t>
-      </w:r>
-    </w:p>
-    <w:p>
-      <w:pPr>
-        <w:numPr>
-          <w:ilvl w:val="0"/>
-          <w:numId w:val="49"/>
-        </w:numPr>
-      </w:pPr>
-      <w:r>
-        <w:t xml:space="preserve">AI retry cost amplification </w:t>
-      </w:r>
-    </w:p>
-    <w:p>
-      <w:pPr>
-        <w:rPr>
-          <w:b/>
-          <w:bCs/>
-        </w:rPr>
-      </w:pPr>
-      <w:r>
-        <w:rPr>
-          <w:b/>
-          <w:bCs/>
-        </w:rPr>
-        <w:t>UX Risks</w:t>
-      </w:r>
-    </w:p>
-    <w:p>
-      <w:pPr>
-        <w:numPr>
-          <w:ilvl w:val="0"/>
-          <w:numId w:val="50"/>
-        </w:numPr>
-      </w:pPr>
-      <w:r>
-        <w:t xml:space="preserve">onboarding complexity (API key requirement) </w:t>
-      </w:r>
-    </w:p>
-    <w:p>
-      <w:pPr>
-        <w:numPr>
-          <w:ilvl w:val="0"/>
-          <w:numId w:val="50"/>
-        </w:numPr>
-      </w:pPr>
-      <w:r>
-        <w:t xml:space="preserve">trust issues in scoring accuracy </w:t>
-      </w:r>
-    </w:p>
-    <w:p>
-      <w:pPr>
-        <w:numPr>
-          <w:ilvl w:val="0"/>
-          <w:numId w:val="50"/>
-        </w:numPr>
-      </w:pPr>
-      <w:r>
-        <w:t xml:space="preserve">perceived inconsistency due to eventual sync </w:t>
-      </w:r>
-    </w:p>
-    <w:p>
-      <w:pPr>
-        <w:rPr>
-          <w:b/>
-          <w:bCs/>
-        </w:rPr>
-      </w:pPr>
-      <w:r>
-        <w:rPr>
-          <w:b/>
-          <w:bCs/>
-        </w:rPr>
-        <w:t>Scaling Risks</w:t>
-      </w:r>
-    </w:p>
-    <w:p>
-      <w:pPr>
-        <w:numPr>
-          <w:ilvl w:val="0"/>
-          <w:numId w:val="51"/>
-        </w:numPr>
-      </w:pPr>
-      <w:r>
-        <w:t xml:space="preserve">queue backlog explosion offline </w:t>
-      </w:r>
-    </w:p>
-    <w:p>
-      <w:pPr>
-        <w:numPr>
-          <w:ilvl w:val="0"/>
-          <w:numId w:val="51"/>
-        </w:numPr>
-      </w:pPr>
-      <w:r>
-        <w:t xml:space="preserve">AI request duplication (&lt;1% acceptable threshold) </w:t>
-      </w:r>
-    </w:p>
-    <w:p>
-      <w:pPr>
-        <w:numPr>
-          <w:ilvl w:val="0"/>
-          <w:numId w:val="51"/>
-        </w:numPr>
-      </w:pPr>
-      <w:r>
-        <w:t xml:space="preserve">storage growth from logs </w:t>
-      </w:r>
-    </w:p>
-    <w:p>
-      <w:pPr>
-        <w:rPr>
-          <w:b/>
-          <w:bCs/>
-        </w:rPr>
-      </w:pPr>
-      <w:r>
-        <w:rPr>
-          <w:b/>
-          <w:bCs/>
-        </w:rPr>
-        <w:t>Business Risks</w:t>
-      </w:r>
-    </w:p>
-    <w:p>
-      <w:pPr>
-        <w:numPr>
-          <w:ilvl w:val="0"/>
-          <w:numId w:val="52"/>
-        </w:numPr>
-      </w:pPr>
-      <w:r>
-        <w:t xml:space="preserve">reliance on user-provided AI keys </w:t>
-      </w:r>
-    </w:p>
-    <w:p>
-      <w:pPr>
-        <w:numPr>
-          <w:ilvl w:val="0"/>
-          <w:numId w:val="52"/>
-        </w:numPr>
-      </w:pPr>
-      <w:r>
-        <w:t xml:space="preserve">dependency on external ATS stability </w:t>
-      </w:r>
-    </w:p>
-    <w:p>
-      <w:r>
-        <w:pict w14:anchorId="0536793E">
-          <v:rect id="_x0000_i1177" style="width:0;height:1.5pt" o:hralign="center" o:hrstd="t" o:hr="t" fillcolor="#a0a0a0" stroked="f"/>
+        <w:t>15. Future Expansion Opportunities</w:t>
+      </w:r>
+    </w:p>
+    <w:p>
+      <w:pPr>
+        <w:numPr>
+          <w:ilvl w:val="0"/>
+          <w:numId w:val="53"/>
+        </w:numPr>
+      </w:pPr>
+      <w:r>
+        <w:t xml:space="preserve">predictive job matching engine </w:t>
+      </w:r>
+    </w:p>
+    <w:p>
+      <w:pPr>
+        <w:numPr>
+          <w:ilvl w:val="0"/>
+          <w:numId w:val="53"/>
+        </w:numPr>
+      </w:pPr>
+      <w:r>
+        <w:t xml:space="preserve">interview preparation assistant </w:t>
+      </w:r>
+    </w:p>
+    <w:p>
+      <w:pPr>
+        <w:numPr>
+          <w:ilvl w:val="0"/>
+          <w:numId w:val="53"/>
+        </w:numPr>
+      </w:pPr>
+      <w:r>
+        <w:t xml:space="preserve">salary benchmarking </w:t>
+      </w:r>
+    </w:p>
+    <w:p>
+      <w:pPr>
+        <w:numPr>
+          <w:ilvl w:val="0"/>
+          <w:numId w:val="53"/>
+        </w:numPr>
+      </w:pPr>
+      <w:r>
+        <w:t xml:space="preserve">career progression analytics </w:t>
+      </w:r>
+    </w:p>
+    <w:p>
+      <w:pPr>
+        <w:numPr>
+          <w:ilvl w:val="0"/>
+          <w:numId w:val="53"/>
+        </w:numPr>
+      </w:pPr>
+      <w:r>
+        <w:t xml:space="preserve">recruiter-side SaaS layer (optional pivot) </w:t>
+      </w:r>
+    </w:p>
+    <w:p>
+      <w:pPr>
+        <w:numPr>
+          <w:ilvl w:val="0"/>
+          <w:numId w:val="53"/>
+        </w:numPr>
+      </w:pPr>
+      <w:r>
+        <w:t xml:space="preserve">multi-device sync support </w:t>
+      </w:r>
+    </w:p>
+    <w:p>
+      <w:pPr>
+        <w:numPr>
+          <w:ilvl w:val="0"/>
+          <w:numId w:val="53"/>
+        </w:numPr>
+      </w:pPr>
+      <w:r>
+        <w:t xml:space="preserve">browser extension enhancement layer </w:t>
+      </w:r>
+    </w:p>
+    <w:p>
+      <w:r>
+        <w:pict w14:anchorId="15D5ECB5">
+          <v:rect id="_x0000_i1108" style="width:0;height:1.5pt" o:hralign="center" o:hrstd="t" o:hr="t" fillcolor="#a0a0a0" stroked="f"/>
         </w:pict>
       </w:r>
     </w:p>
@@ -3356,105 +3455,6 @@
           <w:b/>
           <w:bCs/>
         </w:rPr>
-        <w:t>15. Future Expansion Opportunities</w:t>
-      </w:r>
-    </w:p>
-    <w:p>
-      <w:pPr>
-        <w:numPr>
-          <w:ilvl w:val="0"/>
-          <w:numId w:val="53"/>
-        </w:numPr>
-      </w:pPr>
-      <w:r>
-        <w:t xml:space="preserve">predictive job matching engine </w:t>
-      </w:r>
-    </w:p>
-    <w:p>
-      <w:pPr>
-        <w:numPr>
-          <w:ilvl w:val="0"/>
-          <w:numId w:val="53"/>
-        </w:numPr>
-      </w:pPr>
-      <w:r>
-        <w:t xml:space="preserve">interview preparation assistant </w:t>
-      </w:r>
-    </w:p>
-    <w:p>
-      <w:pPr>
-        <w:numPr>
-          <w:ilvl w:val="0"/>
-          <w:numId w:val="53"/>
-        </w:numPr>
-      </w:pPr>
-      <w:r>
-        <w:t xml:space="preserve">salary benchmarking </w:t>
-      </w:r>
-    </w:p>
-    <w:p>
-      <w:pPr>
-        <w:numPr>
-          <w:ilvl w:val="0"/>
-          <w:numId w:val="53"/>
-        </w:numPr>
-      </w:pPr>
-      <w:r>
-        <w:t xml:space="preserve">career progression analytics </w:t>
-      </w:r>
-    </w:p>
-    <w:p>
-      <w:pPr>
-        <w:numPr>
-          <w:ilvl w:val="0"/>
-          <w:numId w:val="53"/>
-        </w:numPr>
-      </w:pPr>
-      <w:r>
-        <w:t xml:space="preserve">recruiter-side SaaS layer (optional pivot) </w:t>
-      </w:r>
-    </w:p>
-    <w:p>
-      <w:pPr>
-        <w:numPr>
-          <w:ilvl w:val="0"/>
-          <w:numId w:val="53"/>
-        </w:numPr>
-      </w:pPr>
-      <w:r>
-        <w:t xml:space="preserve">multi-device sync support </w:t>
-      </w:r>
-    </w:p>
-    <w:p>
-      <w:pPr>
-        <w:numPr>
-          <w:ilvl w:val="0"/>
-          <w:numId w:val="53"/>
-        </w:numPr>
-      </w:pPr>
-      <w:r>
-        <w:t xml:space="preserve">browser extension enhancement layer </w:t>
-      </w:r>
-    </w:p>
-    <w:p>
-      <w:r>
-        <w:pict w14:anchorId="15D5ECB5">
-          <v:rect id="_x0000_i1178" style="width:0;height:1.5pt" o:hralign="center" o:hrstd="t" o:hr="t" fillcolor="#a0a0a0" stroked="f"/>
-        </w:pict>
-      </w:r>
-    </w:p>
-    <w:p>
-      <w:pPr>
-        <w:rPr>
-          <w:b/>
-          <w:bCs/>
-        </w:rPr>
-      </w:pPr>
-      <w:r>
-        <w:rPr>
-          <w:b/>
-          <w:bCs/>
-        </w:rPr>
         <w:t>16. Implementation Readiness Assessment</w:t>
       </w:r>
     </w:p>
@@ -3538,23 +3538,23 @@
           <w:b/>
           <w:bCs/>
         </w:rPr>
+        <w:t>Execution Complexity: MEDIUM-HIGH</w:t>
+      </w:r>
+    </w:p>
+    <w:p>
+      <w:r>
+        <w:t>Main complexity drivers:</w:t>
+      </w:r>
+    </w:p>
+    <w:p>
+      <w:pPr>
+        <w:numPr>
+          <w:ilvl w:val="0"/>
+          <w:numId w:val="55"/>
+        </w:numPr>
+      </w:pPr>
+      <w:r>
         <w:lastRenderedPageBreak/>
-        <w:t>Execution Complexity: MEDIUM-HIGH</w:t>
-      </w:r>
-    </w:p>
-    <w:p>
-      <w:r>
-        <w:t>Main complexity drivers:</w:t>
-      </w:r>
-    </w:p>
-    <w:p>
-      <w:pPr>
-        <w:numPr>
-          <w:ilvl w:val="0"/>
-          <w:numId w:val="55"/>
-        </w:numPr>
-      </w:pPr>
-      <w:r>
         <w:t xml:space="preserve">local-first sync model </w:t>
       </w:r>
     </w:p>
@@ -12757,6 +12757,7 @@
   <w:style w:type="character" w:default="1" w:styleId="DefaultParagraphFont">
     <w:name w:val="Default Paragraph Font"/>
     <w:uiPriority w:val="1"/>
+    <w:semiHidden/>
     <w:unhideWhenUsed/>
   </w:style>
   <w:style w:type="table" w:default="1" w:styleId="TableNormal">

</xml_diff>